<commit_message>
Add app-wide voice control, standard form labels and focus ring, CI
- Voice control: top-bar button, floating launcher on sign-in and the Services
  site, dark bar with Numbers / Replies / Help / Stop, spoken and typed commands
  (Alt+V, Alt+C), numbered click targets, dictation, display and account commands
- Spec 005 and a 27-check browser check; SRS and README updated to 1.2
- Material UI labels sit above the field; one navy/gold focus ring (3:1+),
  calmer autofill, no spell-check underline on the sign-in field
- Contrast fixes for small gold text and struck-through tasks
- GitHub Actions workflow: lint, tests and build for frontend and backend

Co-Authored-By: Claude Sonnet 5.5 <noreply@anthropic.com>
</commit_message>
<xml_diff>
--- a/docs/SRS.docx
+++ b/docs/SRS.docx
@@ -27,7 +27,7 @@
           <w:color w:val="9A6F1E"/>
           <w:sz w:val="24"/>
         </w:rPr>
-        <w:t>Version 1.1 · 28 October 2026</w:t>
+        <w:t>Version 1.2 · 29 October 2026</w:t>
       </w:r>
     </w:p>
     <w:tbl>
@@ -123,7 +123,7 @@
                 <w:i w:val="0"/>
                 <w:sz w:val="18"/>
               </w:rPr>
-              <w:t>1.1</w:t>
+              <w:t>1.2</w:t>
             </w:r>
           </w:p>
         </w:tc>
@@ -209,7 +209,7 @@
                 <w:i w:val="0"/>
                 <w:sz w:val="18"/>
               </w:rPr>
-              <w:t>Baseline of what is built, reviewed against the code and the Spec Kit specifications; 1.1 closes gaps G1–G3 and G6–G11 (see 11.1)</w:t>
+              <w:t>Baseline of what is built, reviewed against the code and the Spec Kit specifications; 1.1 closes gaps G1–G3 and G6–G11 (see 11.1); 1.2 adds app-wide voice control (spec 005)</w:t>
             </w:r>
           </w:p>
         </w:tc>
@@ -10127,7 +10127,7 @@
                 <w:i w:val="0"/>
                 <w:sz w:val="18"/>
               </w:rPr>
-              <w:t>Dictation and voice commands ("open calendar") with the browser's speech recognition, in six languages. It is opt-in: the person must accept that Chrome and Edge send the audio to the browser vendor, and it is for demonstration material only. Without support or consent the recorder stays simulated.</w:t>
+              <w:t>Dictation on the Voice screen with the browser's speech recognition, in six languages, opt-in and for demonstration material only. Without support or consent the recorder stays simulated.</w:t>
             </w:r>
           </w:p>
         </w:tc>
@@ -10164,6 +10164,734 @@
                 <w:sz w:val="18"/>
               </w:rPr>
               <w:t>Built (see 11.2 for the confidentiality limit)</w:t>
+            </w:r>
+          </w:p>
+        </w:tc>
+      </w:tr>
+      <w:tr>
+        <w:trPr>
+          <w:cantSplit/>
+        </w:trPr>
+        <w:tc>
+          <w:tcPr>
+            <w:tcW w:type="dxa" w:w="935"/>
+          </w:tcPr>
+          <w:p>
+            <w:pPr>
+              <w:spacing w:after="40" w:before="40"/>
+            </w:pPr>
+            <w:r>
+              <w:rPr>
+                <w:b w:val="0"/>
+                <w:i w:val="0"/>
+                <w:sz w:val="18"/>
+              </w:rPr>
+              <w:t>FR-VOI-01</w:t>
+            </w:r>
+          </w:p>
+        </w:tc>
+        <w:tc>
+          <w:tcPr>
+            <w:tcW w:type="dxa" w:w="4603"/>
+          </w:tcPr>
+          <w:p>
+            <w:pPr>
+              <w:spacing w:after="40" w:before="40"/>
+            </w:pPr>
+            <w:r>
+              <w:rPr>
+                <w:b/>
+                <w:i w:val="0"/>
+                <w:sz w:val="18"/>
+              </w:rPr>
+              <w:t>App-wide voice control</w:t>
+            </w:r>
+            <w:r>
+              <w:rPr>
+                <w:b w:val="0"/>
+                <w:i w:val="0"/>
+                <w:sz w:val="18"/>
+              </w:rPr>
+              <w:t xml:space="preserve"> (top-bar Voice button, Alt+V): move to any screen, back, forward, reload; scroll; press a button, link or tab by name; focus a field by label; type or dictate into it; set a named field; choose a list option; tick or untick a box; next, previous, clear, submit; text bigger, smaller, normal; high contrast on and off; read the page; sign out; help; stop.</w:t>
+            </w:r>
+          </w:p>
+        </w:tc>
+        <w:tc>
+          <w:tcPr>
+            <w:tcW w:type="dxa" w:w="503"/>
+          </w:tcPr>
+          <w:p>
+            <w:pPr>
+              <w:spacing w:after="40" w:before="40"/>
+            </w:pPr>
+            <w:r>
+              <w:rPr>
+                <w:b w:val="0"/>
+                <w:i w:val="0"/>
+                <w:sz w:val="18"/>
+              </w:rPr>
+              <w:t>S</w:t>
+            </w:r>
+          </w:p>
+        </w:tc>
+        <w:tc>
+          <w:tcPr>
+            <w:tcW w:type="dxa" w:w="3596"/>
+            <w:shd w:val="clear" w:color="auto" w:fill="E3F1E9"/>
+          </w:tcPr>
+          <w:p>
+            <w:pPr>
+              <w:spacing w:after="40" w:before="40"/>
+            </w:pPr>
+            <w:r>
+              <w:rPr>
+                <w:b w:val="0"/>
+                <w:i w:val="0"/>
+                <w:sz w:val="18"/>
+              </w:rPr>
+              <w:t>Built</w:t>
+            </w:r>
+          </w:p>
+        </w:tc>
+      </w:tr>
+      <w:tr>
+        <w:trPr>
+          <w:cantSplit/>
+        </w:trPr>
+        <w:tc>
+          <w:tcPr>
+            <w:tcW w:type="dxa" w:w="935"/>
+          </w:tcPr>
+          <w:p>
+            <w:pPr>
+              <w:spacing w:after="40" w:before="40"/>
+            </w:pPr>
+            <w:r>
+              <w:rPr>
+                <w:b w:val="0"/>
+                <w:i w:val="0"/>
+                <w:sz w:val="18"/>
+              </w:rPr>
+              <w:t>FR-VOI-02</w:t>
+            </w:r>
+          </w:p>
+        </w:tc>
+        <w:tc>
+          <w:tcPr>
+            <w:tcW w:type="dxa" w:w="4603"/>
+          </w:tcPr>
+          <w:p>
+            <w:pPr>
+              <w:spacing w:after="40" w:before="40"/>
+            </w:pPr>
+            <w:r>
+              <w:rPr>
+                <w:b w:val="0"/>
+                <w:i w:val="0"/>
+                <w:sz w:val="18"/>
+              </w:rPr>
+              <w:t>Controls are matched by what a person would say (label, name, text, placeholder). If nothing matches it says so and changes nothing. Dictated values keep their capitals and punctuation.</w:t>
+            </w:r>
+          </w:p>
+        </w:tc>
+        <w:tc>
+          <w:tcPr>
+            <w:tcW w:type="dxa" w:w="503"/>
+          </w:tcPr>
+          <w:p>
+            <w:pPr>
+              <w:spacing w:after="40" w:before="40"/>
+            </w:pPr>
+            <w:r>
+              <w:rPr>
+                <w:b w:val="0"/>
+                <w:i w:val="0"/>
+                <w:sz w:val="18"/>
+              </w:rPr>
+              <w:t>S</w:t>
+            </w:r>
+          </w:p>
+        </w:tc>
+        <w:tc>
+          <w:tcPr>
+            <w:tcW w:type="dxa" w:w="3596"/>
+            <w:shd w:val="clear" w:color="auto" w:fill="E3F1E9"/>
+          </w:tcPr>
+          <w:p>
+            <w:pPr>
+              <w:spacing w:after="40" w:before="40"/>
+            </w:pPr>
+            <w:r>
+              <w:rPr>
+                <w:b w:val="0"/>
+                <w:i w:val="0"/>
+                <w:sz w:val="18"/>
+              </w:rPr>
+              <w:t>Built</w:t>
+            </w:r>
+          </w:p>
+        </w:tc>
+      </w:tr>
+      <w:tr>
+        <w:trPr>
+          <w:cantSplit/>
+        </w:trPr>
+        <w:tc>
+          <w:tcPr>
+            <w:tcW w:type="dxa" w:w="935"/>
+          </w:tcPr>
+          <w:p>
+            <w:pPr>
+              <w:spacing w:after="40" w:before="40"/>
+            </w:pPr>
+            <w:r>
+              <w:rPr>
+                <w:b w:val="0"/>
+                <w:i w:val="0"/>
+                <w:sz w:val="18"/>
+              </w:rPr>
+              <w:t>FR-VOI-03</w:t>
+            </w:r>
+          </w:p>
+        </w:tc>
+        <w:tc>
+          <w:tcPr>
+            <w:tcW w:type="dxa" w:w="4603"/>
+          </w:tcPr>
+          <w:p>
+            <w:pPr>
+              <w:spacing w:after="40" w:before="40"/>
+            </w:pPr>
+            <w:r>
+              <w:rPr>
+                <w:b w:val="0"/>
+                <w:i w:val="0"/>
+                <w:sz w:val="18"/>
+              </w:rPr>
+              <w:t>Every command gives a visible, announced answer and can be spoken aloud on request; a status area shows listening, what was heard and what was done.</w:t>
+            </w:r>
+          </w:p>
+        </w:tc>
+        <w:tc>
+          <w:tcPr>
+            <w:tcW w:type="dxa" w:w="503"/>
+          </w:tcPr>
+          <w:p>
+            <w:pPr>
+              <w:spacing w:after="40" w:before="40"/>
+            </w:pPr>
+            <w:r>
+              <w:rPr>
+                <w:b w:val="0"/>
+                <w:i w:val="0"/>
+                <w:sz w:val="18"/>
+              </w:rPr>
+              <w:t>S</w:t>
+            </w:r>
+          </w:p>
+        </w:tc>
+        <w:tc>
+          <w:tcPr>
+            <w:tcW w:type="dxa" w:w="3596"/>
+            <w:shd w:val="clear" w:color="auto" w:fill="E3F1E9"/>
+          </w:tcPr>
+          <w:p>
+            <w:pPr>
+              <w:spacing w:after="40" w:before="40"/>
+            </w:pPr>
+            <w:r>
+              <w:rPr>
+                <w:b w:val="0"/>
+                <w:i w:val="0"/>
+                <w:sz w:val="18"/>
+              </w:rPr>
+              <w:t>Built</w:t>
+            </w:r>
+          </w:p>
+        </w:tc>
+      </w:tr>
+      <w:tr>
+        <w:trPr>
+          <w:cantSplit/>
+        </w:trPr>
+        <w:tc>
+          <w:tcPr>
+            <w:tcW w:type="dxa" w:w="935"/>
+          </w:tcPr>
+          <w:p>
+            <w:pPr>
+              <w:spacing w:after="40" w:before="40"/>
+            </w:pPr>
+            <w:r>
+              <w:rPr>
+                <w:b w:val="0"/>
+                <w:i w:val="0"/>
+                <w:sz w:val="18"/>
+              </w:rPr>
+              <w:t>FR-VOI-04</w:t>
+            </w:r>
+          </w:p>
+        </w:tc>
+        <w:tc>
+          <w:tcPr>
+            <w:tcW w:type="dxa" w:w="4603"/>
+          </w:tcPr>
+          <w:p>
+            <w:pPr>
+              <w:spacing w:after="40" w:before="40"/>
+            </w:pPr>
+            <w:r>
+              <w:rPr>
+                <w:b w:val="0"/>
+                <w:i w:val="0"/>
+                <w:sz w:val="18"/>
+              </w:rPr>
+              <w:t>Before first use a privacy warning (the browser vendor receives the audio; demonstration material only) must be agreed to; the microphone is not started before that.</w:t>
+            </w:r>
+          </w:p>
+        </w:tc>
+        <w:tc>
+          <w:tcPr>
+            <w:tcW w:type="dxa" w:w="503"/>
+          </w:tcPr>
+          <w:p>
+            <w:pPr>
+              <w:spacing w:after="40" w:before="40"/>
+            </w:pPr>
+            <w:r>
+              <w:rPr>
+                <w:b w:val="0"/>
+                <w:i w:val="0"/>
+                <w:sz w:val="18"/>
+              </w:rPr>
+              <w:t>M</w:t>
+            </w:r>
+          </w:p>
+        </w:tc>
+        <w:tc>
+          <w:tcPr>
+            <w:tcW w:type="dxa" w:w="3596"/>
+            <w:shd w:val="clear" w:color="auto" w:fill="E3F1E9"/>
+          </w:tcPr>
+          <w:p>
+            <w:pPr>
+              <w:spacing w:after="40" w:before="40"/>
+            </w:pPr>
+            <w:r>
+              <w:rPr>
+                <w:b w:val="0"/>
+                <w:i w:val="0"/>
+                <w:sz w:val="18"/>
+              </w:rPr>
+              <w:t>Built</w:t>
+            </w:r>
+          </w:p>
+        </w:tc>
+      </w:tr>
+      <w:tr>
+        <w:trPr>
+          <w:cantSplit/>
+        </w:trPr>
+        <w:tc>
+          <w:tcPr>
+            <w:tcW w:type="dxa" w:w="935"/>
+          </w:tcPr>
+          <w:p>
+            <w:pPr>
+              <w:spacing w:after="40" w:before="40"/>
+            </w:pPr>
+            <w:r>
+              <w:rPr>
+                <w:b w:val="0"/>
+                <w:i w:val="0"/>
+                <w:sz w:val="18"/>
+              </w:rPr>
+              <w:t>FR-VOI-05</w:t>
+            </w:r>
+          </w:p>
+        </w:tc>
+        <w:tc>
+          <w:tcPr>
+            <w:tcW w:type="dxa" w:w="4603"/>
+          </w:tcPr>
+          <w:p>
+            <w:pPr>
+              <w:spacing w:after="40" w:before="40"/>
+            </w:pPr>
+            <w:r>
+              <w:rPr>
+                <w:b w:val="0"/>
+                <w:i w:val="0"/>
+                <w:sz w:val="18"/>
+              </w:rPr>
+              <w:t>Alt+C opens a box to type any command, with the same result as speaking it (no microphone needed).</w:t>
+            </w:r>
+          </w:p>
+        </w:tc>
+        <w:tc>
+          <w:tcPr>
+            <w:tcW w:type="dxa" w:w="503"/>
+          </w:tcPr>
+          <w:p>
+            <w:pPr>
+              <w:spacing w:after="40" w:before="40"/>
+            </w:pPr>
+            <w:r>
+              <w:rPr>
+                <w:b w:val="0"/>
+                <w:i w:val="0"/>
+                <w:sz w:val="18"/>
+              </w:rPr>
+              <w:t>S</w:t>
+            </w:r>
+          </w:p>
+        </w:tc>
+        <w:tc>
+          <w:tcPr>
+            <w:tcW w:type="dxa" w:w="3596"/>
+            <w:shd w:val="clear" w:color="auto" w:fill="E3F1E9"/>
+          </w:tcPr>
+          <w:p>
+            <w:pPr>
+              <w:spacing w:after="40" w:before="40"/>
+            </w:pPr>
+            <w:r>
+              <w:rPr>
+                <w:b w:val="0"/>
+                <w:i w:val="0"/>
+                <w:sz w:val="18"/>
+              </w:rPr>
+              <w:t>Built</w:t>
+            </w:r>
+          </w:p>
+        </w:tc>
+      </w:tr>
+      <w:tr>
+        <w:trPr>
+          <w:cantSplit/>
+        </w:trPr>
+        <w:tc>
+          <w:tcPr>
+            <w:tcW w:type="dxa" w:w="935"/>
+          </w:tcPr>
+          <w:p>
+            <w:pPr>
+              <w:spacing w:after="40" w:before="40"/>
+            </w:pPr>
+            <w:r>
+              <w:rPr>
+                <w:b w:val="0"/>
+                <w:i w:val="0"/>
+                <w:sz w:val="18"/>
+              </w:rPr>
+              <w:t>FR-VOI-07</w:t>
+            </w:r>
+          </w:p>
+        </w:tc>
+        <w:tc>
+          <w:tcPr>
+            <w:tcW w:type="dxa" w:w="4603"/>
+          </w:tcPr>
+          <w:p>
+            <w:pPr>
+              <w:spacing w:after="40" w:before="40"/>
+            </w:pPr>
+            <w:r>
+              <w:rPr>
+                <w:b w:val="0"/>
+                <w:i w:val="0"/>
+                <w:sz w:val="18"/>
+              </w:rPr>
+              <w:t xml:space="preserve">A dark bar (microphone, state, last answer, </w:t>
+            </w:r>
+            <w:r>
+              <w:rPr>
+                <w:b/>
+                <w:i w:val="0"/>
+                <w:sz w:val="18"/>
+              </w:rPr>
+              <w:t>Numbers</w:t>
+            </w:r>
+            <w:r>
+              <w:rPr>
+                <w:b w:val="0"/>
+                <w:i w:val="0"/>
+                <w:sz w:val="18"/>
+              </w:rPr>
+              <w:t xml:space="preserve">, </w:t>
+            </w:r>
+            <w:r>
+              <w:rPr>
+                <w:b/>
+                <w:i w:val="0"/>
+                <w:sz w:val="18"/>
+              </w:rPr>
+              <w:t>Replies</w:t>
+            </w:r>
+            <w:r>
+              <w:rPr>
+                <w:b w:val="0"/>
+                <w:i w:val="0"/>
+                <w:sz w:val="18"/>
+              </w:rPr>
+              <w:t xml:space="preserve">, </w:t>
+            </w:r>
+            <w:r>
+              <w:rPr>
+                <w:b/>
+                <w:i w:val="0"/>
+                <w:sz w:val="18"/>
+              </w:rPr>
+              <w:t>Help</w:t>
+            </w:r>
+            <w:r>
+              <w:rPr>
+                <w:b w:val="0"/>
+                <w:i w:val="0"/>
+                <w:sz w:val="18"/>
+              </w:rPr>
+              <w:t xml:space="preserve">, </w:t>
+            </w:r>
+            <w:r>
+              <w:rPr>
+                <w:b/>
+                <w:i w:val="0"/>
+                <w:sz w:val="18"/>
+              </w:rPr>
+              <w:t>Stop</w:t>
+            </w:r>
+            <w:r>
+              <w:rPr>
+                <w:b w:val="0"/>
+                <w:i w:val="0"/>
+                <w:sz w:val="18"/>
+              </w:rPr>
+              <w:t xml:space="preserve">) shows while voice control is on. </w:t>
+            </w:r>
+            <w:r>
+              <w:rPr>
+                <w:b/>
+                <w:i w:val="0"/>
+                <w:sz w:val="18"/>
+              </w:rPr>
+              <w:t>Numbers</w:t>
+            </w:r>
+            <w:r>
+              <w:rPr>
+                <w:b w:val="0"/>
+                <w:i w:val="0"/>
+                <w:sz w:val="18"/>
+              </w:rPr>
+              <w:t xml:space="preserve"> badges every pressable item so it can be pressed by saying its number; </w:t>
+            </w:r>
+            <w:r>
+              <w:rPr>
+                <w:b/>
+                <w:i w:val="0"/>
+                <w:sz w:val="18"/>
+              </w:rPr>
+              <w:t>Replies</w:t>
+            </w:r>
+            <w:r>
+              <w:rPr>
+                <w:b w:val="0"/>
+                <w:i w:val="0"/>
+                <w:sz w:val="18"/>
+              </w:rPr>
+              <w:t xml:space="preserve"> lists what was said and answered.</w:t>
+            </w:r>
+          </w:p>
+        </w:tc>
+        <w:tc>
+          <w:tcPr>
+            <w:tcW w:type="dxa" w:w="503"/>
+          </w:tcPr>
+          <w:p>
+            <w:pPr>
+              <w:spacing w:after="40" w:before="40"/>
+            </w:pPr>
+            <w:r>
+              <w:rPr>
+                <w:b w:val="0"/>
+                <w:i w:val="0"/>
+                <w:sz w:val="18"/>
+              </w:rPr>
+              <w:t>S</w:t>
+            </w:r>
+          </w:p>
+        </w:tc>
+        <w:tc>
+          <w:tcPr>
+            <w:tcW w:type="dxa" w:w="3596"/>
+            <w:shd w:val="clear" w:color="auto" w:fill="E3F1E9"/>
+          </w:tcPr>
+          <w:p>
+            <w:pPr>
+              <w:spacing w:after="40" w:before="40"/>
+            </w:pPr>
+            <w:r>
+              <w:rPr>
+                <w:b w:val="0"/>
+                <w:i w:val="0"/>
+                <w:sz w:val="18"/>
+              </w:rPr>
+              <w:t>Built</w:t>
+            </w:r>
+          </w:p>
+        </w:tc>
+      </w:tr>
+      <w:tr>
+        <w:trPr>
+          <w:cantSplit/>
+        </w:trPr>
+        <w:tc>
+          <w:tcPr>
+            <w:tcW w:type="dxa" w:w="935"/>
+          </w:tcPr>
+          <w:p>
+            <w:pPr>
+              <w:spacing w:after="40" w:before="40"/>
+            </w:pPr>
+            <w:r>
+              <w:rPr>
+                <w:b w:val="0"/>
+                <w:i w:val="0"/>
+                <w:sz w:val="18"/>
+              </w:rPr>
+              <w:t>FR-VOI-08</w:t>
+            </w:r>
+          </w:p>
+        </w:tc>
+        <w:tc>
+          <w:tcPr>
+            <w:tcW w:type="dxa" w:w="4603"/>
+          </w:tcPr>
+          <w:p>
+            <w:pPr>
+              <w:spacing w:after="40" w:before="40"/>
+            </w:pPr>
+            <w:r>
+              <w:rPr>
+                <w:b w:val="0"/>
+                <w:i w:val="0"/>
+                <w:sz w:val="18"/>
+              </w:rPr>
+              <w:t>Voice control is available on every screen: top bar in the workspace, and a corner launcher on the sign-in screen and the full-page Services site.</w:t>
+            </w:r>
+          </w:p>
+        </w:tc>
+        <w:tc>
+          <w:tcPr>
+            <w:tcW w:type="dxa" w:w="503"/>
+          </w:tcPr>
+          <w:p>
+            <w:pPr>
+              <w:spacing w:after="40" w:before="40"/>
+            </w:pPr>
+            <w:r>
+              <w:rPr>
+                <w:b w:val="0"/>
+                <w:i w:val="0"/>
+                <w:sz w:val="18"/>
+              </w:rPr>
+              <w:t>S</w:t>
+            </w:r>
+          </w:p>
+        </w:tc>
+        <w:tc>
+          <w:tcPr>
+            <w:tcW w:type="dxa" w:w="3596"/>
+            <w:shd w:val="clear" w:color="auto" w:fill="E3F1E9"/>
+          </w:tcPr>
+          <w:p>
+            <w:pPr>
+              <w:spacing w:after="40" w:before="40"/>
+            </w:pPr>
+            <w:r>
+              <w:rPr>
+                <w:b w:val="0"/>
+                <w:i w:val="0"/>
+                <w:sz w:val="18"/>
+              </w:rPr>
+              <w:t>Built</w:t>
+            </w:r>
+          </w:p>
+        </w:tc>
+      </w:tr>
+      <w:tr>
+        <w:trPr>
+          <w:cantSplit/>
+        </w:trPr>
+        <w:tc>
+          <w:tcPr>
+            <w:tcW w:type="dxa" w:w="935"/>
+          </w:tcPr>
+          <w:p>
+            <w:pPr>
+              <w:spacing w:after="40" w:before="40"/>
+            </w:pPr>
+            <w:r>
+              <w:rPr>
+                <w:b w:val="0"/>
+                <w:i w:val="0"/>
+                <w:sz w:val="18"/>
+              </w:rPr>
+              <w:t>FR-VOI-06</w:t>
+            </w:r>
+          </w:p>
+        </w:tc>
+        <w:tc>
+          <w:tcPr>
+            <w:tcW w:type="dxa" w:w="4603"/>
+          </w:tcPr>
+          <w:p>
+            <w:pPr>
+              <w:spacing w:after="40" w:before="40"/>
+            </w:pPr>
+            <w:r>
+              <w:rPr>
+                <w:b w:val="0"/>
+                <w:i w:val="0"/>
+                <w:sz w:val="18"/>
+              </w:rPr>
+              <w:t>Spoken commands in Hindi, Marathi, Gujarati, Kannada and Tamil; hands-free wake word; on-device recognition. Commands are English only; dictation text can be in the six languages.</w:t>
+            </w:r>
+          </w:p>
+        </w:tc>
+        <w:tc>
+          <w:tcPr>
+            <w:tcW w:type="dxa" w:w="503"/>
+          </w:tcPr>
+          <w:p>
+            <w:pPr>
+              <w:spacing w:after="40" w:before="40"/>
+            </w:pPr>
+            <w:r>
+              <w:rPr>
+                <w:b w:val="0"/>
+                <w:i w:val="0"/>
+                <w:sz w:val="18"/>
+              </w:rPr>
+              <w:t>C</w:t>
+            </w:r>
+          </w:p>
+        </w:tc>
+        <w:tc>
+          <w:tcPr>
+            <w:tcW w:type="dxa" w:w="3596"/>
+            <w:shd w:val="clear" w:color="auto" w:fill="F8E1DE"/>
+          </w:tcPr>
+          <w:p>
+            <w:pPr>
+              <w:spacing w:after="40" w:before="40"/>
+            </w:pPr>
+            <w:r>
+              <w:rPr>
+                <w:b w:val="0"/>
+                <w:i w:val="0"/>
+                <w:sz w:val="18"/>
+              </w:rPr>
+              <w:t>Not built</w:t>
             </w:r>
           </w:p>
         </w:tc>
@@ -13818,7 +14546,7 @@
                 <w:i w:val="0"/>
                 <w:sz w:val="18"/>
               </w:rPr>
-              <w:t>525 passed, 2 skipped</w:t>
+              <w:t>590 passed, 2 skipped</w:t>
             </w:r>
           </w:p>
         </w:tc>
@@ -14010,6 +14738,75 @@
                 <w:sz w:val="18"/>
               </w:rPr>
               <w:t>Passes</w:t>
+            </w:r>
+          </w:p>
+        </w:tc>
+      </w:tr>
+      <w:tr>
+        <w:trPr>
+          <w:cantSplit/>
+        </w:trPr>
+        <w:tc>
+          <w:tcPr>
+            <w:tcW w:type="dxa" w:w="1671"/>
+          </w:tcPr>
+          <w:p>
+            <w:pPr>
+              <w:spacing w:after="40" w:before="40"/>
+            </w:pPr>
+            <w:r>
+              <w:rPr>
+                <w:b w:val="0"/>
+                <w:i w:val="0"/>
+                <w:sz w:val="18"/>
+              </w:rPr>
+              <w:t>Browser, voice control</w:t>
+            </w:r>
+          </w:p>
+        </w:tc>
+        <w:tc>
+          <w:tcPr>
+            <w:tcW w:type="dxa" w:w="4112"/>
+          </w:tcPr>
+          <w:p>
+            <w:pPr>
+              <w:spacing w:after="40" w:before="40"/>
+            </w:pPr>
+            <w:r>
+              <w:rPr>
+                <w:rFonts w:ascii="Consolas" w:hAnsi="Consolas"/>
+                <w:b w:val="0"/>
+                <w:i w:val="0"/>
+                <w:color w:val="3B3A33"/>
+                <w:sz w:val="16"/>
+              </w:rPr>
+              <w:t>specs/005-voice-control/browser-check.mjs</w:t>
+            </w:r>
+            <w:r>
+              <w:rPr>
+                <w:b w:val="0"/>
+                <w:i w:val="0"/>
+                <w:sz w:val="18"/>
+              </w:rPr>
+              <w:t xml:space="preserve"> (mock mode)</w:t>
+            </w:r>
+          </w:p>
+        </w:tc>
+        <w:tc>
+          <w:tcPr>
+            <w:tcW w:type="dxa" w:w="3855"/>
+          </w:tcPr>
+          <w:p>
+            <w:pPr>
+              <w:spacing w:after="40" w:before="40"/>
+            </w:pPr>
+            <w:r>
+              <w:rPr>
+                <w:b w:val="0"/>
+                <w:i w:val="0"/>
+                <w:sz w:val="18"/>
+              </w:rPr>
+              <w:t>27/27</w:t>
             </w:r>
           </w:p>
         </w:tc>
@@ -14530,6 +15327,47 @@
                 <w:i w:val="0"/>
                 <w:sz w:val="18"/>
               </w:rPr>
+              <w:t>005 Voice control</w:t>
+            </w:r>
+          </w:p>
+        </w:tc>
+        <w:tc>
+          <w:tcPr>
+            <w:tcW w:type="dxa" w:w="6493"/>
+          </w:tcPr>
+          <w:p>
+            <w:pPr>
+              <w:spacing w:after="40" w:before="40"/>
+            </w:pPr>
+            <w:r>
+              <w:rPr>
+                <w:b w:val="0"/>
+                <w:i w:val="0"/>
+                <w:sz w:val="18"/>
+              </w:rPr>
+              <w:t>FR-VOI-01 to FR-VOI-06, FR-WSP-04</w:t>
+            </w:r>
+          </w:p>
+        </w:tc>
+      </w:tr>
+      <w:tr>
+        <w:trPr>
+          <w:cantSplit/>
+        </w:trPr>
+        <w:tc>
+          <w:tcPr>
+            <w:tcW w:type="dxa" w:w="3145"/>
+          </w:tcPr>
+          <w:p>
+            <w:pPr>
+              <w:spacing w:after="40" w:before="40"/>
+            </w:pPr>
+            <w:r>
+              <w:rPr>
+                <w:b w:val="0"/>
+                <w:i w:val="0"/>
+                <w:sz w:val="18"/>
+              </w:rPr>
               <w:t>004 Workspace backend</w:t>
             </w:r>
           </w:p>
@@ -14961,7 +15799,7 @@
                 <w:i w:val="0"/>
                 <w:sz w:val="18"/>
               </w:rPr>
-              <w:t xml:space="preserve"> Dictation and voice commands, opt-in, six languages (FR-WSP-04).</w:t>
+              <w:t xml:space="preserve"> Dictation on the Voice screen (FR-WSP-04) and, in 1.2, full app-wide voice control with 27 browser checks (FR-VOI-01 to 05). Numbers, replies and a corner launcher on every screen were added (FR-VOI-07, 08). Commands in languages other than English remain open (FR-VOI-06).</w:t>
             </w:r>
           </w:p>
         </w:tc>

</xml_diff>